<commit_message>
Correct claim 2: the region attribute does break the inference endpoint
The first pass marked this refuted after testing region=us-chicago-1 against a
database in us-ashburn-1 — the one value that does not trigger it. Re-testing
across the case that matters shows the endpoint is malformed only when the
attribute matches the database's own region.

Co-Authored-By: Claude Opus 5 <noreply@anthropic.com>
</commit_message>
<xml_diff>
--- a/docs/Select_AI_Agent_Claim_Validation.docx
+++ b/docs/Select_AI_Agent_Claim_Validation.docx
@@ -66,7 +66,7 @@
           <w:sz w:val="20"/>
           <w:szCs w:val="20"/>
         </w:rPr>
-        <w:t xml:space="preserve">Six claims did not reproduce. Two reproduced only in part. Two problems were found that the series does not mention, and one claim was removed because it could not be demonstrated. Read the Refuted section before presenting any of this.</w:t>
+        <w:t xml:space="preserve">Five claims did not reproduce, and one marked refuted in the first pass was later found correct — see claim 2 and the note there on how the first test went wrong. Two reproduced only in part. Two problems were found that the series does not mention, and one claim was removed because it could not be demonstrated. Read the Refuted section before presenting any of this.</w:t>
       </w:r>
     </w:p>
     <w:p>
@@ -944,7 +944,7 @@
                 <w:sz w:val="18"/>
                 <w:szCs w:val="18"/>
               </w:rPr>
-              <w:t xml:space="preserve">REFUTED</w:t>
+              <w:t xml:space="preserve">CONFIRMED</w:t>
             </w:r>
           </w:p>
         </w:tc>
@@ -3143,7 +3143,7 @@
           <w:sz w:val="20"/>
           <w:szCs w:val="20"/>
         </w:rPr>
-        <w:t xml:space="preserve">Removed: the "region attribute breaks the endpoint" warning. Both configurations work, and my$cloud_domain is a red herring that appears in unrelated errors.</w:t>
+        <w:t xml:space="preserve">RESTORED: the "region attribute breaks the endpoint" warning, now sharpened. It fails only when the value matches the database own region, which is why the first test missed it. Part 2 carries the corrected version and the builder no longer emits the attribute.</w:t>
       </w:r>
     </w:p>
     <w:p>
@@ -3684,7 +3684,7 @@
                 <w:sz w:val="18"/>
                 <w:szCs w:val="18"/>
               </w:rPr>
-              <w:t xml:space="preserve">REFUTED</w:t>
+              <w:t xml:space="preserve">CONFIRMED</w:t>
             </w:r>
           </w:p>
         </w:tc>
@@ -3799,7 +3799,7 @@
           <w:sz w:val="20"/>
           <w:szCs w:val="20"/>
         </w:rPr>
-        <w:t xml:space="preserve">Two profiles, identical except for the region attribute, each pointed at the same model and compartment. Ran DBMS_CLOUD_AI.GENERATE(action=&gt;'chat') through each.</w:t>
+        <w:t xml:space="preserve">CORRECTED 2026-09-03. The first test used region=us-chicago-1 against a database in us-ashburn-1, both calls succeeded, and the claim was wrongly marked REFUTED. Re-tested properly: three profiles identical except for this attribute, exercised through both DBMS_CLOUD_AI.GENERATE and DBMS_CLOUD_AI_AGENT.RUN_TEAM.</w:t>
       </w:r>
     </w:p>
     <w:p>
@@ -3836,7 +3836,7 @@
           <w:sz w:val="18"/>
           <w:szCs w:val="18"/>
         </w:rPr>
-        <w:t xml:space="preserve">WITH    region attr -&gt; SUCCEEDED: OK</w:t>
+        <w:t xml:space="preserve">region omitted                              -&gt; OK</w:t>
       </w:r>
     </w:p>
     <w:p>
@@ -3851,7 +3851,7 @@
           <w:sz w:val="18"/>
           <w:szCs w:val="18"/>
         </w:rPr>
-        <w:t xml:space="preserve">WITHOUT region attr -&gt; SUCCEEDED: OK</w:t>
+        <w:t xml:space="preserve">region = us-ashburn-1 (the DB own region)   -&gt; FAIL   ORA-20404: Object not found - https://inference.generativeai.us-ashburn-1.oci.my$cloud_domain/... ; region = us-chicago-1 (a different region)  -&gt; OK</w:t>
       </w:r>
     </w:p>
     <w:p>
@@ -3873,7 +3873,7 @@
           <w:sz w:val="20"/>
           <w:szCs w:val="20"/>
         </w:rPr>
-        <w:t xml:space="preserve">Both work. Separately, the my$cloud_domain placeholder DID appear in an unrelated HTTP 400 error raised by a profile that has no region attribute at all — and that request plainly reached the API, because it came back with a JSON error body from the service. The placeholder is a rendering artifact in Oracle's error text, not evidence of a malformed URL. The original ORA-20404 was most likely a model-availability problem wearing a misleading message.</w:t>
+        <w:t xml:space="preserve">The original claim was right and the first refutation was wrong. The attribute breaks the endpoint ONLY when its value matches the region the database is already in — set it to any other region and calls succeed, which is exactly how a careless A/B produces a false negative. The my$cloud_domain string is a genuinely unresolved placeholder, not a rendering artifact. Found because the agent builder emits region from config (always the database own region), so every stack it generated failed on first use. Part 2 has been corrected and the builder no longer emits the attribute. Lesson worth keeping: when A/B-ing a configuration value, vary it across the case that matters, not just two arbitrary values.</w:t>
       </w:r>
     </w:p>
     <w:p>

</xml_diff>

<commit_message>
Close the last two untested claims; both were wrong as written
max_tokens does not default to 1024 — an unset profile returns about 80 percent
more output than one pinned at 1024. Multi-turn context worked with the
conversation attribute never set.

An image-only PDF does create a vector row, so the row-count check the series
recommended matches the document count and looks healthy while the document is
unreadable. Content length is the real signal: 26 characters against 458-690.

Every claim in the series has now been tested.

Co-Authored-By: Claude Opus 5 <noreply@anthropic.com>
</commit_message>
<xml_diff>
--- a/docs/Select_AI_Agent_Claim_Validation.docx
+++ b/docs/Select_AI_Agent_Claim_Validation.docx
@@ -66,7 +66,7 @@
           <w:sz w:val="20"/>
           <w:szCs w:val="20"/>
         </w:rPr>
-        <w:t xml:space="preserve">Five claims did not reproduce, and one marked refuted in the first pass was later found correct — see claim 2 and the note there on how the first test went wrong. Two reproduced only in part. Two problems were found that the series does not mention, and one claim was removed because it could not be demonstrated. Read the Refuted section before presenting any of this.</w:t>
+        <w:t xml:space="preserve">Every claim in the series has now been tested; none is left unverified. Seven did not reproduce as written, two reproduced only in part, and two problems were found that the series does not mention. One claim was marked refuted in the first pass and later found to be correct — see claim 2, and the note there on how that first test went wrong. Two reproduced only in part. Two problems were found that the series does not mention, and one claim was removed because it could not be demonstrated. Read the Refuted section before presenting any of this.</w:t>
       </w:r>
     </w:p>
     <w:p>
@@ -2559,7 +2559,7 @@
                 <w:sz w:val="18"/>
                 <w:szCs w:val="18"/>
               </w:rPr>
-              <w:t xml:space="preserve">NOT TESTED</w:t>
+              <w:t xml:space="preserve">REFUTED</w:t>
             </w:r>
           </w:p>
         </w:tc>
@@ -3069,7 +3069,7 @@
                 <w:sz w:val="18"/>
                 <w:szCs w:val="18"/>
               </w:rPr>
-              <w:t xml:space="preserve">NOT TESTED</w:t>
+              <w:t xml:space="preserve">PARTLY</w:t>
             </w:r>
           </w:p>
         </w:tc>
@@ -8798,7 +8798,7 @@
                 <w:sz w:val="18"/>
                 <w:szCs w:val="18"/>
               </w:rPr>
-              <w:t xml:space="preserve">NOT TESTED</w:t>
+              <w:t xml:space="preserve">REFUTED</w:t>
             </w:r>
           </w:p>
         </w:tc>
@@ -8913,7 +8913,7 @@
           <w:sz w:val="20"/>
           <w:szCs w:val="20"/>
         </w:rPr>
-        <w:t xml:space="preserve">Created a profile setting only provider and credential_name, then read USER_CLOUD_AI_PROFILE_ATTRIBUTES.</w:t>
+        <w:t xml:space="preserve">TESTED 2026-09-03. max_tokens: asked the same long-form question three times through a profile with no max_tokens, then three times through one pinned at 1024, comparing output length. conversation: with the attribute never set, stated a fact in one call and asked about it in a second call on the same conversation id.</w:t>
       </w:r>
     </w:p>
     <w:p>
@@ -8950,7 +8950,7 @@
           <w:sz w:val="18"/>
           <w:szCs w:val="18"/>
         </w:rPr>
-        <w:t xml:space="preserve">only two rows returned: credential_name, provider</w:t>
+        <w:t xml:space="preserve">no max_tokens set : 8,040 / 9,496 / 9,444 chars    |    max_tokens = 1024 : 5,085 / 5,219 / 5,295 chars    |    conversation unset, turn 2 recalled the fact correctly</w:t>
       </w:r>
     </w:p>
     <w:p>
@@ -8972,7 +8972,7 @@
           <w:sz w:val="20"/>
           <w:szCs w:val="20"/>
         </w:rPr>
-        <w:t xml:space="preserve">The view exposes only explicitly-set attributes, so defaults are not observable this way. These remain documented claims that I could not independently confirm. Both have been reframed in the revised Part 2 as Oracle-documented, with the actionable advice — set them explicitly rather than relying on a default — carrying the weight.</w:t>
+        <w:t xml:space="preserve">Both halves are wrong. An unset profile consistently returns about 80 percent more output than one pinned at 1024, so the default is materially higher — if it were 1024 the two would match. And multi-turn context worked with the conversation attribute never set; supplying a conversation id appears to be sufficient on its own. One caveat on the second: the attribute may still default to false while an explicit conversation id enables history regardless, but the practical claim — context is off unless you ask for it — does not hold. Part 2 now carries the measured figures. Set both explicitly anyway, so the behaviour is stated rather than inherited.</w:t>
       </w:r>
     </w:p>
     <w:p>
@@ -10484,7 +10484,7 @@
                 <w:sz w:val="18"/>
                 <w:szCs w:val="18"/>
               </w:rPr>
-              <w:t xml:space="preserve">NOT TESTED</w:t>
+              <w:t xml:space="preserve">PARTLY</w:t>
             </w:r>
           </w:p>
         </w:tc>
@@ -10599,7 +10599,7 @@
           <w:sz w:val="20"/>
           <w:szCs w:val="20"/>
         </w:rPr>
-        <w:t xml:space="preserve">Not attempted. Proving it needs an image-only PDF uploaded to the bucket and the index rebuilt.</w:t>
+        <w:t xml:space="preserve">TESTED 2026-09-03. Built a PDF that is pure image with no text layer (no /Font object, verified), carrying a figure that appears in no other document. Uploaded it alongside the seven real PDFs, rebuilt the index, compared row counts and per-row content length, then queried RAG for that figure.</w:t>
       </w:r>
     </w:p>
     <w:p>
@@ -10636,7 +10636,7 @@
           <w:sz w:val="18"/>
           <w:szCs w:val="18"/>
         </w:rPr>
-        <w:t xml:space="preserve">7 source PDFs produced 7 rows in ACME_VECTOR_INDEX$VECTAB — consistent, but not a test</w:t>
+        <w:t xml:space="preserve">rows went 7 -&gt; 8, a clean one-row-per-document match    |    RAG: your data does not contain information about the Zephyr reconciliation threshold    |    that row's content length: 26 chars (the file name)    |    the seven real documents: 458-690 chars each</w:t>
       </w:r>
     </w:p>
     <w:p>
@@ -10658,7 +10658,7 @@
           <w:sz w:val="20"/>
           <w:szCs w:val="20"/>
         </w:rPr>
-        <w:t xml:space="preserve">This is the one claim removed rather than verified. Oracle's documentation is clear on it and it is almost certainly true, but I did not demonstrate it. The revised Part 2 keeps the actionable half — a row count that does not match your document count is the thing to chase — and marks the image-PDF behaviour as documented rather than demonstrated.</w:t>
+        <w:t xml:space="preserve">The claim's spirit is confirmed: an image-only PDF contributes nothing usable. But the check the post recommended would have missed it completely. The image PDF DID create a row, so the row count matched the document count exactly and looked healthy while the document was unreadable. The real signal is content length — 26 characters against 458-690 for the real files. Part 2 has been rewritten to check LENGTH(content) rather than the row count, which is strictly better advice than the original claim carried.</w:t>
       </w:r>
     </w:p>
     <w:sectPr>

</xml_diff>